<commit_message>
docs: corrige descrição de escopo no relatório VDEX III
O relatório descrevia o sistema como protótipo em ambiente de testes
com dados fictícios, mas o sistema roda em produção com contas de
acesso reais, banco persistente e envio de e-mail funcional. O uso
com doadores reais ainda depende da validação formal das regras de
aptidão pela equipe do HEMOSC.

Trello #23
</commit_message>
<xml_diff>
--- a/docs/base/Relatorio_VDEX_III_Send_Hemosc.docx
+++ b/docs/base/Relatorio_VDEX_III_Send_Hemosc.docx
@@ -895,7 +895,7 @@
           <w:rFonts w:cs="Arial"/>
           <w:szCs w:val="24"/>
         </w:rPr>
-        <w:t xml:space="preserve">Com o Projeto Send Hemosc, o grupo buscou aplicar os conhecimentos de desenvolvimento de software a uma demanda concreta do serviço de hemoterapia, identificada junto a profissionais do Hospital Regional Hans Dieter Schmidt, em Joinville, unidade que abriga a Agência Transfusional do HEMOSC. A proposta consiste em um protótipo de sistema que relaciona o estoque de hemocomponentes por tipo sanguíneo ao cadastro individual de doadores, de modo a identificar quem está apto a doar e direcionar a comunicação a esse público específico. O trabalho é conduzido em ambiente de testes, com dados fictícios, e tem como finalidade apresentar o resultado aos profissionais da instituição para avaliação e devolutiva quanto a uma possível melhoria futura do processo de captação.</w:t>
+        <w:t xml:space="preserve">Com o Projeto Send Hemosc, o grupo buscou aplicar os conhecimentos de desenvolvimento de software a uma demanda concreta do serviço de hemoterapia, identificada junto a profissionais do Hospital Regional Hans Dieter Schmidt, em Joinville, unidade que abriga a Agência Transfusional do HEMOSC. A proposta consiste em um sistema que relaciona o estoque de hemocomponentes por tipo sanguíneo ao cadastro individual de doadores, de modo a identificar quem está apto a doar e direcionar a comunicação a esse público específico. O sistema está em produção, com contas de acesso reais, banco de dados persistente e envio de e-mail funcional, e tem como finalidade apresentar o resultado aos profissionais da instituição para avaliação e devolutiva quanto a uma possível melhoria futura do processo de captação; o uso com doadores reais depende da validação formal das regras de aptidão pela equipe do HEMOSC.</w:t>
       </w:r>
     </w:p>
     <w:p>
@@ -956,7 +956,7 @@
         <w:jc w:val="both"/>
       </w:pPr>
       <w:r>
-        <w:t xml:space="preserve">O objetivo geral é demonstrar, por meio de um protótipo, que o cruzamento entre a situação do estoque e a aptidão individual dos doadores permite uma captação mais direcionada e menos dependente de campanhas genéricas. O público-alvo é composto pelos doadores cadastrados e pela equipe responsável pela captação de doadores e pela gestão de estoque de hemocomponentes. A entrega prevista é um protótipo executado em ambiente de testes, com dados fictícios e sem previsão de implantação em produção, cujo propósito é ser apresentado aos profissionais da instituição para avaliação e devolutiva sobre uma possível melhoria futura do processo de captação.</w:t>
+        <w:t xml:space="preserve">O objetivo geral é demonstrar que o cruzamento entre a situação do estoque e a aptidão individual dos doadores permite uma captação mais direcionada e menos dependente de campanhas genéricas. O público-alvo é composto pelos doadores cadastrados e pela equipe responsável pela captação de doadores e pela gestão de estoque de hemocomponentes. A entrega é um sistema em produção, com contas de acesso reais, banco de dados persistente (PostgreSQL) e envio de e-mail funcional (Brevo), cujo propósito é ser apresentado aos profissionais da instituição para avaliação e devolutiva sobre uma possível melhoria futura do processo de captação. O uso com dados de doadores reais depende de validação formal das regras de aptidão pela equipe do HEMOSC.</w:t>
       </w:r>
     </w:p>
     <w:p>
@@ -996,7 +996,7 @@
         <w:jc w:val="both"/>
       </w:pPr>
       <w:r>
-        <w:t xml:space="preserve">A equipe é composta por Leonardo Dias, Eduardo da Costa e Jean Nack, responsáveis pelo desenvolvimento, e conta com a participação de três profissionais do Hospital Regional Hans Dieter Schmidt, em Joinville, na condição de comunidade parceira. Definiu-se desde o início que o resultado seria mantido como protótipo em ambiente de testes, com dados fictícios, em razão da sensibilidade dos dados envolvidos e da necessidade de validação das regras de intervalo entre doações junto à equipe de hemoterapia. Este relatório corresponde a uma entrega parcial: as etapas seguintes do cronograma serão descritas nas próximas entregas.</w:t>
+        <w:t xml:space="preserve">A equipe é composta por Leonardo Dias, Eduardo da Costa e Jean Nack, responsáveis pelo desenvolvimento, e conta com a participação de três profissionais do Hospital Regional Hans Dieter Schmidt, em Joinville, na condição de comunidade parceira. Definiu-se desde o início que o sistema trataria dados sensíveis de saúde e exigiria validação das regras de intervalo entre doações junto à equipe de hemoterapia antes de qualquer uso com doadores reais; por isso, o sistema roda hoje em produção, com contas de acesso reais e envio de e-mail funcional, mas sem cadastro de doadores reais até essa validação. Este relatório corresponde a uma entrega parcial: as etapas seguintes do cronograma serão descritas nas próximas entregas.</w:t>
       </w:r>
     </w:p>
     <w:p>
@@ -1601,7 +1601,7 @@
         <w:jc w:val="both"/>
       </w:pPr>
       <w:r>
-        <w:t xml:space="preserve">A decisão mais relevante da etapa foi manter o projeto como protótipo, executado em ambiente de testes e alimentado por dados fictícios, em vez de uma solução destinada à implantação. Essa opção considera que o sistema trataria dados pessoais e de saúde, sujeitos à Lei Geral de Proteção de Dados, e que as regras de intervalo entre doações precisam ser validadas pela equipe de hemoterapia antes de qualquer uso real. A etapa estava planejada para 19/08/2026 e foi realizada em 26/08/2026.</w:t>
+        <w:t xml:space="preserve">A decisão mais relevante da etapa foi condicionar o uso com doadores reais à validação formal das regras de aptidão pela equipe de hemoterapia, em vez de colocar o sistema em uso real desde já. Essa opção considera que o sistema trata dados pessoais e de saúde, sujeitos à Lei Geral de Proteção de Dados. O sistema já roda em produção — com contas de acesso reais, banco de dados persistente e envio de e-mail funcional —, mas o cadastro de doadores permanece restrito a dados de demonstração até essa validação. A etapa estava planejada para 19/08/2026 e foi realizada em 26/08/2026.</w:t>
       </w:r>
     </w:p>
     <w:p>

</xml_diff>